<commit_message>
Redesign visual dokumen ke bahasa visual PDF acuan (presentasi saja, nol pipeline)
Urutan halaman ala acuan (field TOC ditanam template, --toc dilepas utk SDD),
tipografi baru (heading centered caps, body justified, dot leader, footer
italic+nomor), tabel (padding, vAlign center, cantSplit, lebar kolom rasio
dash, header center via post-process — Word abaikan pPr dari table style),
diagram 300 dpi + anti-upscale + PLANTUML_LIMIT_SIZE. Diverifikasi 4 putaran
visual (docx->PDF Word COM->PNG), $0 dari Contract B tersimpan. 196 test hijau.
</commit_message>
<xml_diff>
--- a/app/templates/reference.docx
+++ b/app/templates/reference.docx
@@ -331,21 +331,81 @@
 <w:ftr xmlns:m="http://schemas.openxmlformats.org/officeDocument/2006/math" xmlns:mc="http://schemas.openxmlformats.org/markup-compatibility/2006" xmlns:mo="http://schemas.microsoft.com/office/mac/office/2008/main" xmlns:mv="urn:schemas-microsoft-com:mac:vml" xmlns:o="urn:schemas-microsoft-com:office:office" xmlns:r="http://schemas.openxmlformats.org/officeDocument/2006/relationships" xmlns:v="urn:schemas-microsoft-com:vml" xmlns:w10="urn:schemas-microsoft-com:office:word" xmlns:w14="http://schemas.microsoft.com/office/word/2010/wordml" xmlns:w="http://schemas.openxmlformats.org/wordprocessingml/2006/main" xmlns:wne="http://schemas.microsoft.com/office/word/2006/wordml" xmlns:wp14="http://schemas.microsoft.com/office/word/2010/wordprocessingDrawing" xmlns:wp="http://schemas.openxmlformats.org/drawingml/2006/wordprocessingDrawing" xmlns:wpc="http://schemas.microsoft.com/office/word/2010/wordprocessingCanvas" xmlns:wpg="http://schemas.microsoft.com/office/word/2010/wordprocessingGroup" xmlns:wpi="http://schemas.microsoft.com/office/word/2010/wordprocessingInk" xmlns:wps="http://schemas.microsoft.com/office/word/2010/wordprocessingShape" mc:Ignorable="w14 wp14">
   <w:p>
     <w:pPr>
-      <w:pStyle w:val="Footer"/>
-    </w:pPr>
-    <w:fldSimple w:instr=" PAGE ">
-      <w:r>
-        <w:t>1</w:t>
-      </w:r>
-    </w:fldSimple>
+      <w:tabs>
+        <w:tab w:val="right" w:pos="9350"/>
+      </w:tabs>
+    </w:pPr>
     <w:r>
-      <w:t xml:space="preserve">   </w:t>
+      <w:rPr>
+        <w:i/>
+        <w:sz w:val="18"/>
+      </w:rPr>
+      <w:fldChar w:fldCharType="begin"/>
     </w:r>
-    <w:fldSimple w:instr=" TITLE ">
-      <w:r>
-        <w:t/>
-      </w:r>
-    </w:fldSimple>
+    <w:r>
+      <w:rPr>
+        <w:i/>
+        <w:sz w:val="18"/>
+      </w:rPr>
+      <w:instrText xml:space="preserve"> TITLE </w:instrText>
+    </w:r>
+    <w:r>
+      <w:rPr>
+        <w:i/>
+        <w:sz w:val="18"/>
+      </w:rPr>
+      <w:fldChar w:fldCharType="separate"/>
+    </w:r>
+    <w:r>
+      <w:rPr>
+        <w:i/>
+        <w:sz w:val="18"/>
+      </w:rPr>
+      <w:t/>
+    </w:r>
+    <w:r>
+      <w:rPr>
+        <w:i/>
+        <w:sz w:val="18"/>
+      </w:rPr>
+      <w:fldChar w:fldCharType="end"/>
+    </w:r>
+    <w:r>
+      <w:rPr>
+        <w:sz w:val="18"/>
+      </w:rPr>
+      <w:tab/>
+    </w:r>
+    <w:r>
+      <w:rPr>
+        <w:sz w:val="18"/>
+      </w:rPr>
+      <w:fldChar w:fldCharType="begin"/>
+    </w:r>
+    <w:r>
+      <w:rPr>
+        <w:sz w:val="18"/>
+      </w:rPr>
+      <w:instrText xml:space="preserve"> PAGE </w:instrText>
+    </w:r>
+    <w:r>
+      <w:rPr>
+        <w:sz w:val="18"/>
+      </w:rPr>
+      <w:fldChar w:fldCharType="separate"/>
+    </w:r>
+    <w:r>
+      <w:rPr>
+        <w:sz w:val="18"/>
+      </w:rPr>
+      <w:t>1</w:t>
+    </w:r>
+    <w:r>
+      <w:rPr>
+        <w:sz w:val="18"/>
+      </w:rPr>
+      <w:fldChar w:fldCharType="end"/>
+    </w:r>
   </w:p>
 </w:ftr>
 </file>
@@ -532,7 +592,8 @@
     <w:link w:val="BodyTextChar"/>
     <w:qFormat/>
     <w:pPr>
-      <w:spacing w:after="120" w:line="300" w:lineRule="auto"/>
+      <w:jc w:val="both"/>
+      <w:spacing w:after="160" w:line="320" w:lineRule="auto"/>
     </w:pPr>
     <w:rPr>
       <w:sz w:val="22"/>
@@ -545,7 +606,8 @@
     <w:next w:val="BodyText"/>
     <w:qFormat/>
     <w:pPr>
-      <w:spacing w:after="120" w:line="300" w:lineRule="auto"/>
+      <w:jc w:val="both"/>
+      <w:spacing w:after="160" w:line="320" w:lineRule="auto"/>
     </w:pPr>
     <w:rPr>
       <w:sz w:val="22"/>
@@ -557,11 +619,11 @@
     <w:basedOn w:val="BodyText"/>
     <w:qFormat/>
     <w:pPr>
-      <w:spacing w:after="40" w:line="260" w:lineRule="auto"/>
-    </w:pPr>
-    <w:rPr>
-      <w:sz w:val="20"/>
-      <w:szCs w:val="20"/>
+      <w:spacing w:after="40" w:line="280" w:lineRule="auto"/>
+    </w:pPr>
+    <w:rPr>
+      <w:sz w:val="21"/>
+      <w:szCs w:val="21"/>
     </w:rPr>
   </w:style>
   <w:style w:type="paragraph" w:styleId="Title">
@@ -575,13 +637,13 @@
     <w:pPr>
       <w:contextualSpacing/>
       <w:jc w:val="center"/>
-      <w:spacing w:after="160"/>
+      <w:spacing w:before="1280" w:after="560"/>
     </w:pPr>
     <w:rPr>
       <w:rFonts w:asciiTheme="majorHAnsi" w:eastAsiaTheme="majorEastAsia" w:hAnsiTheme="majorHAnsi" w:cstheme="majorBidi"/>
       <w:b/>
-      <w:sz w:val="52"/>
-      <w:szCs w:val="52"/>
+      <w:sz w:val="44"/>
+      <w:szCs w:val="44"/>
     </w:rPr>
   </w:style>
   <w:style w:type="character" w:customStyle="1" w:styleId="TitleChar">
@@ -709,16 +771,18 @@
     <w:pPr>
       <w:keepLines/>
       <w:outlineLvl w:val="0"/>
-      <w:spacing w:before="400" w:after="160"/>
+      <w:jc w:val="center"/>
+      <w:spacing w:before="560" w:after="240"/>
       <w:keepNext/>
     </w:pPr>
     <w:rPr>
       <w:rFonts w:asciiTheme="majorHAnsi" w:eastAsiaTheme="majorEastAsia" w:hAnsiTheme="majorHAnsi" w:cstheme="majorBidi"/>
       <w:b/>
       <w:caps/>
-      <w:sz w:val="36"/>
-      <w:szCs w:val="36"/>
+      <w:sz w:val="32"/>
+      <w:szCs w:val="32"/>
       <w:color w:val="000000"/>
+      <w:spacing w:val="10"/>
     </w:rPr>
   </w:style>
   <w:style w:type="paragraph" w:styleId="Heading2">
@@ -734,16 +798,18 @@
     <w:pPr>
       <w:keepLines/>
       <w:outlineLvl w:val="1"/>
-      <w:spacing w:before="360" w:after="160"/>
+      <w:jc w:val="center"/>
+      <w:spacing w:before="560" w:after="280"/>
       <w:keepNext/>
     </w:pPr>
     <w:rPr>
       <w:rFonts w:asciiTheme="majorHAnsi" w:eastAsiaTheme="majorEastAsia" w:hAnsiTheme="majorHAnsi" w:cstheme="majorBidi"/>
       <w:b/>
       <w:caps/>
-      <w:sz w:val="30"/>
-      <w:szCs w:val="30"/>
+      <w:sz w:val="28"/>
+      <w:szCs w:val="28"/>
       <w:color w:val="000000"/>
+      <w:spacing w:val="10"/>
     </w:rPr>
   </w:style>
   <w:style w:type="paragraph" w:styleId="Heading3">
@@ -759,7 +825,7 @@
     <w:pPr>
       <w:keepLines/>
       <w:outlineLvl w:val="2"/>
-      <w:spacing w:before="240" w:after="120"/>
+      <w:spacing w:before="320" w:after="160"/>
       <w:keepNext/>
     </w:pPr>
     <w:rPr>
@@ -1074,12 +1140,19 @@
         <w:insideV w:val="single" w:sz="4" w:space="0" w:color="BFBFBF"/>
       </w:tblBorders>
       <w:tblCellMar>
-        <w:top w:w="60" w:type="dxa"/>
-        <w:left w:w="108" w:type="dxa"/>
-        <w:bottom w:w="60" w:type="dxa"/>
-        <w:right w:w="108" w:type="dxa"/>
+        <w:top w:w="80" w:type="dxa"/>
+        <w:left w:w="115" w:type="dxa"/>
+        <w:bottom w:w="80" w:type="dxa"/>
+        <w:right w:w="115" w:type="dxa"/>
       </w:tblCellMar>
     </w:tblPr>
+    <w:trPr>
+      <w:trHeight w:val="300" w:hRule="atLeast"/>
+      <w:cantSplit/>
+    </w:trPr>
+    <w:tcPr>
+      <w:vAlign w:val="center"/>
+    </w:tcPr>
     <w:tblStylePr w:type="firstRow">
       <w:rPr>
         <w:b/>
@@ -1124,13 +1197,14 @@
     <w:basedOn w:val="Caption"/>
     <w:pPr>
       <w:jc w:val="center"/>
-      <w:spacing w:before="80" w:after="240"/>
+      <w:spacing w:before="80" w:after="280"/>
       <w:keepNext/>
     </w:pPr>
     <w:rPr>
       <w:i/>
       <w:sz w:val="18"/>
       <w:szCs w:val="18"/>
+      <w:color w:val="44546A"/>
     </w:rPr>
   </w:style>
   <w:style w:type="paragraph" w:customStyle="1" w:styleId="ImageCaption">
@@ -1138,24 +1212,32 @@
     <w:basedOn w:val="Caption"/>
     <w:pPr>
       <w:jc w:val="center"/>
-      <w:spacing w:before="80" w:after="240"/>
+      <w:spacing w:before="120" w:after="280"/>
     </w:pPr>
     <w:rPr>
       <w:i/>
       <w:sz w:val="18"/>
       <w:szCs w:val="18"/>
+      <w:color w:val="44546A"/>
     </w:rPr>
   </w:style>
   <w:style w:type="paragraph" w:customStyle="1" w:styleId="Figure">
     <w:name w:val="Figure"/>
     <w:basedOn w:val="Normal"/>
+    <w:pPr>
+      <w:jc w:val="center"/>
+      <w:spacing w:before="200" w:after="80"/>
+    </w:pPr>
+    <w:rPr/>
   </w:style>
   <w:style w:type="paragraph" w:customStyle="1" w:styleId="CaptionedFigure">
     <w:name w:val="Captioned Figure"/>
     <w:basedOn w:val="Figure"/>
     <w:pPr>
-      <w:keepNext/>
-    </w:pPr>
+      <w:jc w:val="center"/>
+      <w:spacing w:before="200" w:after="80"/>
+    </w:pPr>
+    <w:rPr/>
   </w:style>
   <w:style w:type="character" w:customStyle="1" w:styleId="BodyTextChar">
     <w:name w:val="Body Text Char"/>
@@ -1196,14 +1278,79 @@
     <w:unhideWhenUsed/>
     <w:qFormat/>
     <w:pPr>
-      <w:spacing w:before="240" w:line="259" w:lineRule="auto"/>
       <w:outlineLvl w:val="9"/>
+      <w:jc w:val="center"/>
+      <w:spacing w:before="0" w:after="360"/>
+      <w:pageBreakBefore/>
     </w:pPr>
     <w:rPr>
       <w:rFonts w:asciiTheme="majorHAnsi" w:eastAsiaTheme="majorEastAsia" w:hAnsiTheme="majorHAnsi" w:cstheme="majorBidi"/>
-      <w:b w:val="0"/>
       <w:bCs w:val="0"/>
-      <w:color w:val="365F91" w:themeColor="accent1" w:themeShade="BF"/>
+      <w:b/>
+      <w:caps/>
+      <w:sz w:val="28"/>
+      <w:szCs w:val="28"/>
+      <w:color w:val="000000"/>
+      <w:spacing w:val="10"/>
+    </w:rPr>
+  </w:style>
+  <w:style w:type="paragraph" w:styleId="TOC1">
+    <w:name w:val="toc 1"/>
+    <w:basedOn w:val="Normal"/>
+    <w:pPr>
+      <w:tabs>
+        <w:tab w:val="right" w:leader="dot" w:pos="9350"/>
+      </w:tabs>
+      <w:spacing w:after="80"/>
+    </w:pPr>
+    <w:rPr>
+      <w:caps/>
+      <w:sz w:val="22"/>
+      <w:szCs w:val="22"/>
+    </w:rPr>
+  </w:style>
+  <w:style w:type="paragraph" w:styleId="TOC2">
+    <w:name w:val="toc 2"/>
+    <w:basedOn w:val="Normal"/>
+    <w:pPr>
+      <w:tabs>
+        <w:tab w:val="right" w:leader="dot" w:pos="9350"/>
+      </w:tabs>
+      <w:spacing w:after="80"/>
+    </w:pPr>
+    <w:rPr>
+      <w:caps/>
+      <w:sz w:val="21"/>
+      <w:szCs w:val="21"/>
+    </w:rPr>
+  </w:style>
+  <w:style w:type="paragraph" w:styleId="TOC3">
+    <w:name w:val="toc 3"/>
+    <w:basedOn w:val="Normal"/>
+    <w:pPr>
+      <w:tabs>
+        <w:tab w:val="right" w:leader="dot" w:pos="9350"/>
+      </w:tabs>
+      <w:spacing w:after="80"/>
+      <w:ind w:left="240"/>
+    </w:pPr>
+    <w:rPr>
+      <w:sz w:val="21"/>
+      <w:szCs w:val="21"/>
+    </w:rPr>
+  </w:style>
+  <w:style w:type="paragraph" w:styleId="TableofFigures">
+    <w:name w:val="table of figures"/>
+    <w:basedOn w:val="Normal"/>
+    <w:pPr>
+      <w:tabs>
+        <w:tab w:val="right" w:leader="dot" w:pos="9350"/>
+      </w:tabs>
+      <w:spacing w:after="80"/>
+    </w:pPr>
+    <w:rPr>
+      <w:sz w:val="21"/>
+      <w:szCs w:val="21"/>
     </w:rPr>
   </w:style>
 </w:styles>

</xml_diff>

<commit_message>
Selaraskan ukuran heading ke angka terukur (16/13/12 -> 14/12/11)
Laporan sebelumnya menyebut ini sebagai gap besar yang butuh keputusan
pemilik: "PREMCO heading 11pt rata kiri bernomor, kita 16pt UPPERCASE
center". Itu salah baca - yang diukur waktu itu SUB-heading
("2.10. Activity Diagram ..." = Calibri-Bold 12pt rata kiri), bukan
heading bab.

Pengukuran ulang per-span pada bab sungguhan (DESKRIPSI APLIKASI, SYSTEM
REQUIREMENT, APPLICATION ARCHITECTURE, APPLICATION SECURITY) menunjukkan
PREMCO memakai Calibri-Bold 14pt HURUF BESAR di TENGAH - persis gaya yang
sudah kita pakai. Jadi tidak ada konflik dengan aturan tipografi pemilik
dan tidak ada keputusan yang perlu diambil; yang berbeda cuma angkanya.

Pelajarannya: mengukur barangnya tidak cukup kalau yang diukur bagian
yang salah. "Heading" itu tiga level berbeda, dan menyamakannya
menghasilkan laporan yang percaya diri tapi keliru plus gate keputusan
palsu.

312 test hijau.
</commit_message>
<xml_diff>
--- a/app/templates/reference.docx
+++ b/app/templates/reference.docx
@@ -784,8 +784,8 @@
       <w:rFonts w:asciiTheme="majorHAnsi" w:eastAsiaTheme="majorEastAsia" w:hAnsiTheme="majorHAnsi" w:cstheme="majorBidi"/>
       <w:b/>
       <w:caps/>
-      <w:sz w:val="32"/>
-      <w:szCs w:val="32"/>
+      <w:sz w:val="28"/>
+      <w:szCs w:val="28"/>
       <w:color w:val="000000"/>
       <w:spacing w:val="10"/>
     </w:rPr>
@@ -811,8 +811,8 @@
     <w:rPr>
       <w:rFonts w:asciiTheme="majorHAnsi" w:eastAsiaTheme="majorEastAsia" w:hAnsiTheme="majorHAnsi" w:cstheme="majorBidi"/>
       <w:b/>
-      <w:sz w:val="26"/>
-      <w:szCs w:val="26"/>
+      <w:sz w:val="24"/>
+      <w:szCs w:val="24"/>
       <w:color w:val="000000"/>
     </w:rPr>
   </w:style>
@@ -837,8 +837,8 @@
     <w:rPr>
       <w:rFonts w:eastAsiaTheme="majorEastAsia" w:cstheme="majorBidi"/>
       <w:b/>
-      <w:sz w:val="24"/>
-      <w:szCs w:val="24"/>
+      <w:sz w:val="22"/>
+      <w:szCs w:val="22"/>
       <w:color w:val="595959"/>
     </w:rPr>
   </w:style>
@@ -1301,8 +1301,8 @@
       <w:bCs w:val="0"/>
       <w:b/>
       <w:caps/>
-      <w:sz w:val="32"/>
-      <w:szCs w:val="32"/>
+      <w:sz w:val="28"/>
+      <w:szCs w:val="28"/>
       <w:color w:val="000000"/>
       <w:spacing w:val="10"/>
     </w:rPr>

</xml_diff>